<commit_message>
feat: implement DocumentGeneratorService and add required templates for payment resolutions and accounting official letters
</commit_message>
<xml_diff>
--- a/backend/storage/templates/Ofic. Conta Plantilla DI 2024.docx
+++ b/backend/storage/templates/Ofic. Conta Plantilla DI 2024.docx
@@ -598,48 +598,253 @@
     </w:p>
     <w:p>
       <w:pPr>
-        <w:jc w:val="both"/>
-        <w:rPr>
-          <w:rFonts w:cs="Arial"/>
-          <w:sz w:val="24"/>
-          <w:szCs w:val="24"/>
-        </w:rPr>
-      </w:pPr>
-      <w:r>
-        <w:rPr>
-          <w:rFonts w:cs="Arial"/>
-          <w:sz w:val="24"/>
-          <w:szCs w:val="24"/>
-        </w:rPr>
-        <w:t>Mediante el Memorando Nº 071-2026-UPP de fecha 12 de enero de 2026 se asigna marco presupuestal para la Escuela de Posgrado en las partidas específicas 2.1.1.5.2.99 Otras retribuciones y complementos por el monto de S/. 150,160.00 para atender el pago de docentes ordinarios.</w:t>
-      </w:r>
-    </w:p>
-    <w:p>
-      <w:pPr>
-        <w:jc w:val="both"/>
-        <w:rPr>
-          <w:rFonts w:cs="Arial"/>
-          <w:sz w:val="24"/>
-          <w:szCs w:val="24"/>
-        </w:rPr>
-      </w:pPr>
-    </w:p>
-    <w:p>
-      <w:pPr>
-        <w:jc w:val="both"/>
-        <w:rPr>
-          <w:rFonts w:cs="Arial"/>
-          <w:sz w:val="24"/>
-          <w:szCs w:val="24"/>
-        </w:rPr>
-      </w:pPr>
-      <w:r>
-        <w:rPr>
-          <w:rFonts w:cs="Arial"/>
-          <w:sz w:val="24"/>
-          <w:szCs w:val="24"/>
-        </w:rPr>
-        <w:t xml:space="preserve">Luego de haber revisado la documentación detallada en la referencia, se remite los documentos para que sigan su trámite de pago correspondiente </w:t>
+        <w:ind w:firstLine="720"/>
+        <w:jc w:val="both"/>
+        <w:rPr>
+          <w:rFonts w:cs="Arial"/>
+          <w:sz w:val="24"/>
+          <w:szCs w:val="24"/>
+        </w:rPr>
+      </w:pPr>
+      <w:r>
+        <w:rPr>
+          <w:color w:val="000000"/>
+        </w:rPr>
+        <w:t xml:space="preserve">Al respecto, </w:t>
+      </w:r>
+      <w:r>
+        <w:rPr>
+          <w:rFonts w:cs="Arial"/>
+          <w:sz w:val="24"/>
+          <w:szCs w:val="24"/>
+        </w:rPr>
+        <w:t>docente ${</w:t>
+      </w:r>
+      <w:proofErr w:type="spellStart"/>
+      <w:r>
+        <w:rPr>
+          <w:rFonts w:cs="Arial"/>
+          <w:sz w:val="24"/>
+          <w:szCs w:val="24"/>
+        </w:rPr>
+        <w:t>Articulo_la_o_el</w:t>
+      </w:r>
+      <w:proofErr w:type="spellEnd"/>
+      <w:r>
+        <w:rPr>
+          <w:rFonts w:cs="Arial"/>
+          <w:sz w:val="24"/>
+          <w:szCs w:val="24"/>
+        </w:rPr>
+        <w:t>} docente ${DOCENTE}</w:t>
+      </w:r>
+      <w:r>
+        <w:rPr>
+          <w:rFonts w:cs="Arial"/>
+          <w:sz w:val="24"/>
+          <w:szCs w:val="24"/>
+        </w:rPr>
+        <w:t xml:space="preserve"> </w:t>
+      </w:r>
+      <w:r>
+        <w:rPr>
+          <w:color w:val="000000"/>
+        </w:rPr>
+        <w:t xml:space="preserve">tiene la condición de docente </w:t>
+      </w:r>
+      <w:r>
+        <w:rPr>
+          <w:rFonts w:cs="Arial"/>
+          <w:sz w:val="24"/>
+          <w:szCs w:val="24"/>
+        </w:rPr>
+        <w:t>${</w:t>
+      </w:r>
+      <w:proofErr w:type="spellStart"/>
+      <w:r>
+        <w:rPr>
+          <w:rFonts w:cs="Arial"/>
+          <w:sz w:val="24"/>
+          <w:szCs w:val="24"/>
+        </w:rPr>
+        <w:t>ordinario_nombrado_ordinaria</w:t>
+      </w:r>
+      <w:proofErr w:type="spellEnd"/>
+      <w:r>
+        <w:rPr>
+          <w:rFonts w:cs="Arial"/>
+          <w:sz w:val="24"/>
+          <w:szCs w:val="24"/>
+          <w:lang w:val="es-PE"/>
+        </w:rPr>
+        <w:t>_</w:t>
+      </w:r>
+      <w:r>
+        <w:rPr>
+          <w:rFonts w:cs="Arial"/>
+          <w:sz w:val="24"/>
+          <w:szCs w:val="24"/>
+        </w:rPr>
+        <w:t>nombrada</w:t>
+      </w:r>
+      <w:r>
+        <w:rPr>
+          <w:rFonts w:cs="Arial"/>
+          <w:sz w:val="24"/>
+          <w:szCs w:val="24"/>
+        </w:rPr>
+        <w:t>}</w:t>
+      </w:r>
+      <w:r>
+        <w:rPr>
+          <w:rFonts w:cs="Arial"/>
+          <w:sz w:val="24"/>
+          <w:szCs w:val="24"/>
+        </w:rPr>
+        <w:t xml:space="preserve"> </w:t>
+      </w:r>
+      <w:r>
+        <w:rPr>
+          <w:color w:val="000000"/>
+        </w:rPr>
+        <w:t>de pregrado de la Universidad Nacional Pedro Ruiz Gallo.</w:t>
+      </w:r>
+    </w:p>
+    <w:p>
+      <w:pPr>
+        <w:ind w:firstLine="720"/>
+        <w:jc w:val="both"/>
+        <w:rPr>
+          <w:rFonts w:cs="Arial"/>
+          <w:sz w:val="24"/>
+          <w:szCs w:val="24"/>
+        </w:rPr>
+      </w:pPr>
+    </w:p>
+    <w:p>
+      <w:pPr>
+        <w:jc w:val="both"/>
+        <w:rPr>
+          <w:rFonts w:cs="Arial"/>
+          <w:sz w:val="24"/>
+          <w:szCs w:val="24"/>
+        </w:rPr>
+      </w:pPr>
+      <w:r>
+        <w:rPr>
+          <w:rFonts w:cs="Arial"/>
+          <w:sz w:val="24"/>
+          <w:szCs w:val="24"/>
+        </w:rPr>
+        <w:t xml:space="preserve">Mediante el Memorando Nº </w:t>
+      </w:r>
+      <w:r>
+        <w:rPr>
+          <w:rFonts w:cs="Arial"/>
+          <w:sz w:val="24"/>
+          <w:szCs w:val="24"/>
+        </w:rPr>
+        <w:t>1355</w:t>
+      </w:r>
+      <w:r>
+        <w:rPr>
+          <w:rFonts w:cs="Arial"/>
+          <w:sz w:val="24"/>
+          <w:szCs w:val="24"/>
+        </w:rPr>
+        <w:t xml:space="preserve">-2026-UPP de fecha </w:t>
+      </w:r>
+      <w:r>
+        <w:rPr>
+          <w:rFonts w:cs="Arial"/>
+          <w:sz w:val="24"/>
+          <w:szCs w:val="24"/>
+        </w:rPr>
+        <w:t xml:space="preserve">04 de junio </w:t>
+      </w:r>
+      <w:r>
+        <w:rPr>
+          <w:rFonts w:cs="Arial"/>
+          <w:sz w:val="24"/>
+          <w:szCs w:val="24"/>
+        </w:rPr>
+        <w:t>de 2026 se asigna marco presupuestal para la Escuela de Posgrado en las partidas específicas 2.1.1.5.2.99 Otras retribuciones y complementos por el monto de S/. 150,160.00 para atender el pago de docentes ordinarios.</w:t>
+      </w:r>
+    </w:p>
+    <w:p>
+      <w:pPr>
+        <w:jc w:val="both"/>
+        <w:rPr>
+          <w:rFonts w:cs="Arial"/>
+          <w:sz w:val="24"/>
+          <w:szCs w:val="24"/>
+        </w:rPr>
+      </w:pPr>
+    </w:p>
+    <w:p>
+      <w:pPr>
+        <w:jc w:val="both"/>
+        <w:rPr>
+          <w:rFonts w:cs="Arial"/>
+          <w:sz w:val="24"/>
+          <w:szCs w:val="24"/>
+        </w:rPr>
+      </w:pPr>
+      <w:r>
+        <w:rPr>
+          <w:rFonts w:cs="Arial"/>
+          <w:sz w:val="24"/>
+          <w:szCs w:val="24"/>
+        </w:rPr>
+        <w:t xml:space="preserve">Luego de haber revisado la documentación detallada en la referencia, se remite los documentos para que sigan su trámite de pago correspondiente en la </w:t>
+      </w:r>
+      <w:r>
+        <w:rPr>
+          <w:rFonts w:cs="Arial"/>
+          <w:sz w:val="24"/>
+          <w:szCs w:val="24"/>
+        </w:rPr>
+        <w:t>Unidad</w:t>
+      </w:r>
+      <w:r>
+        <w:rPr>
+          <w:rFonts w:cs="Arial"/>
+          <w:sz w:val="24"/>
+          <w:szCs w:val="24"/>
+        </w:rPr>
+        <w:t xml:space="preserve"> de </w:t>
+      </w:r>
+      <w:r>
+        <w:rPr>
+          <w:rFonts w:cs="Arial"/>
+          <w:sz w:val="24"/>
+          <w:szCs w:val="24"/>
+        </w:rPr>
+        <w:t>Recursos Humanos</w:t>
+      </w:r>
+      <w:r>
+        <w:rPr>
+          <w:rFonts w:cs="Arial"/>
+          <w:sz w:val="24"/>
+          <w:szCs w:val="24"/>
+        </w:rPr>
+        <w:t xml:space="preserve"> por tener l</w:t>
+      </w:r>
+      <w:r>
+        <w:rPr>
+          <w:rFonts w:cs="Arial"/>
+          <w:sz w:val="24"/>
+          <w:szCs w:val="24"/>
+        </w:rPr>
+        <w:t xml:space="preserve">a condición de docente </w:t>
+      </w:r>
+      <w:r>
+        <w:rPr>
+          <w:rFonts w:cs="Arial"/>
+          <w:sz w:val="24"/>
+          <w:szCs w:val="24"/>
+        </w:rPr>
+        <w:t>$</w:t>
       </w:r>
       <w:bookmarkStart w:id="0" w:name="_GoBack"/>
       <w:bookmarkEnd w:id="0"/>
@@ -649,48 +854,9 @@
           <w:sz w:val="24"/>
           <w:szCs w:val="24"/>
         </w:rPr>
-        <w:t xml:space="preserve">en la </w:t>
-      </w:r>
-      <w:r>
-        <w:rPr>
-          <w:rFonts w:cs="Arial"/>
-          <w:sz w:val="24"/>
-          <w:szCs w:val="24"/>
-        </w:rPr>
-        <w:t>Unidad</w:t>
-      </w:r>
-      <w:r>
-        <w:rPr>
-          <w:rFonts w:cs="Arial"/>
-          <w:sz w:val="24"/>
-          <w:szCs w:val="24"/>
-        </w:rPr>
-        <w:t xml:space="preserve"> de </w:t>
-      </w:r>
-      <w:r>
-        <w:rPr>
-          <w:rFonts w:cs="Arial"/>
-          <w:sz w:val="24"/>
-          <w:szCs w:val="24"/>
-        </w:rPr>
-        <w:t>Recursos Humanos</w:t>
-      </w:r>
-      <w:r>
-        <w:rPr>
-          <w:rFonts w:cs="Arial"/>
-          <w:sz w:val="24"/>
-          <w:szCs w:val="24"/>
-        </w:rPr>
-        <w:t xml:space="preserve"> por tener l</w:t>
-      </w:r>
-      <w:r>
-        <w:rPr>
-          <w:rFonts w:cs="Arial"/>
-          <w:sz w:val="24"/>
-          <w:szCs w:val="24"/>
-        </w:rPr>
-        <w:t xml:space="preserve">a condición de docente </w:t>
-      </w:r>
+        <w:t>{</w:t>
+      </w:r>
+      <w:proofErr w:type="spellStart"/>
       <w:r>
         <w:rPr>
           <w:rFonts w:cs="Arial"/>
@@ -705,7 +871,32 @@
           <w:sz w:val="24"/>
           <w:szCs w:val="24"/>
         </w:rPr>
-        <w:t xml:space="preserve"> ${</w:t>
+        <w:t>_a</w:t>
+      </w:r>
+      <w:proofErr w:type="spellEnd"/>
+      <w:r>
+        <w:rPr>
+          <w:rFonts w:cs="Arial"/>
+          <w:sz w:val="24"/>
+          <w:szCs w:val="24"/>
+        </w:rPr>
+        <w:t>}</w:t>
+      </w:r>
+      <w:r>
+        <w:rPr>
+          <w:rFonts w:cs="Arial"/>
+          <w:sz w:val="24"/>
+          <w:szCs w:val="24"/>
+        </w:rPr>
+        <w:t xml:space="preserve"> </w:t>
+      </w:r>
+      <w:r>
+        <w:rPr>
+          <w:rFonts w:cs="Arial"/>
+          <w:sz w:val="24"/>
+          <w:szCs w:val="24"/>
+        </w:rPr>
+        <w:t>${</w:t>
       </w:r>
       <w:proofErr w:type="spellStart"/>
       <w:r>
@@ -900,7 +1091,7 @@
               </wp:anchor>
             </w:drawing>
           </mc:Choice>
-          <mc:Fallback>
+          <mc:Fallback xmlns:w16cid="http://schemas.microsoft.com/office/word/2016/wordml/cid" xmlns:am3d="http://schemas.microsoft.com/office/drawing/2017/model3d" xmlns:aink="http://schemas.microsoft.com/office/drawing/2016/ink" xmlns:cx8="http://schemas.microsoft.com/office/drawing/2016/5/14/chartex" xmlns:cx7="http://schemas.microsoft.com/office/drawing/2016/5/13/chartex" xmlns:cx6="http://schemas.microsoft.com/office/drawing/2016/5/12/chartex" xmlns:cx5="http://schemas.microsoft.com/office/drawing/2016/5/11/chartex" xmlns:cx4="http://schemas.microsoft.com/office/drawing/2016/5/10/chartex" xmlns:cx3="http://schemas.microsoft.com/office/drawing/2016/5/9/chartex" xmlns:cx2="http://schemas.microsoft.com/office/drawing/2015/10/21/chartex" xmlns:cx1="http://schemas.microsoft.com/office/drawing/2015/9/8/chartex">
             <w:pict>
               <v:line w14:anchorId="7833214D" id="Conector recto 153" o:spid="_x0000_s1026" style="position:absolute;z-index:251659264;visibility:visible;mso-wrap-style:square;mso-wrap-distance-left:9pt;mso-wrap-distance-top:0;mso-wrap-distance-right:9pt;mso-wrap-distance-bottom:0;mso-position-horizontal:absolute;mso-position-horizontal-relative:text;mso-position-vertical:absolute;mso-position-vertical-relative:text" from="135.85pt,10.8pt" to="315.3pt,11.35pt" o:gfxdata="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"/>
             </w:pict>
@@ -1196,7 +1387,7 @@
             </wp:anchor>
           </w:drawing>
         </mc:Choice>
-        <mc:Fallback>
+        <mc:Fallback xmlns:w16cid="http://schemas.microsoft.com/office/word/2016/wordml/cid" xmlns:am3d="http://schemas.microsoft.com/office/drawing/2017/model3d" xmlns:aink="http://schemas.microsoft.com/office/drawing/2016/ink" xmlns:cx8="http://schemas.microsoft.com/office/drawing/2016/5/14/chartex" xmlns:cx7="http://schemas.microsoft.com/office/drawing/2016/5/13/chartex" xmlns:cx6="http://schemas.microsoft.com/office/drawing/2016/5/12/chartex" xmlns:cx5="http://schemas.microsoft.com/office/drawing/2016/5/11/chartex" xmlns:cx4="http://schemas.microsoft.com/office/drawing/2016/5/10/chartex" xmlns:cx3="http://schemas.microsoft.com/office/drawing/2016/5/9/chartex" xmlns:cx2="http://schemas.microsoft.com/office/drawing/2015/10/21/chartex" xmlns:cx1="http://schemas.microsoft.com/office/drawing/2015/9/8/chartex">
           <w:pict>
             <v:shapetype w14:anchorId="37B88594" id="_x0000_t202" coordsize="21600,21600" o:spt="202" path="m,l,21600r21600,l21600,xe">
               <v:stroke joinstyle="miter"/>

</xml_diff>